<commit_message>
updateing geometry in the documents
</commit_message>
<xml_diff>
--- a/Geometry Summary/Hardpoints Suspensão 2027.docx
+++ b/Geometry Summary/Hardpoints Suspensão 2027.docx
@@ -54,7 +54,7 @@
           <w:color w:val="595959"/>
           <w:sz w:val="18"/>
         </w:rPr>
-        <w:t>Generated 2026-08-25 by scripts/build_summary_doc.py from sla_geometry.py and steering_geometry.py. Do not hand-edit: change the config in those scripts and re-run. This document supersedes "Hardpoints Suspensão 2027", whose rate tables predated the upright-rotation sign fix (commit 0e7e524) and whose force tables assumed a different weight distribution from its own roll-stiffness section.</w:t>
+        <w:t>Generated 2026-08-26 by scripts/build_summary_doc.py from sla_geometry.py and steering_geometry.py. Do not hand-edit: change the config in those scripts and re-run. This document supersedes "Hardpoints Suspensão 2027", whose rate tables predated the upright-rotation sign fix (commit 0e7e524) and whose force tables assumed a different weight distribution from its own roll-stiffness section.</w:t>
       </w:r>
     </w:p>
     <w:p>
@@ -3096,7 +3096,7 @@
                 <w:color w:val="1A1A1A"/>
                 <w:sz w:val="19"/>
               </w:rPr>
-              <w:t>0.0382 °/mm</w:t>
+              <w:t>0.0384 °/mm</w:t>
             </w:r>
           </w:p>
         </w:tc>
@@ -3429,7 +3429,7 @@
                 <w:color w:val="1A1A1A"/>
                 <w:sz w:val="19"/>
               </w:rPr>
-              <w:t>-0.0382 °/mm</w:t>
+              <w:t>-0.0384 °/mm</w:t>
             </w:r>
           </w:p>
         </w:tc>
@@ -3475,7 +3475,7 @@
                 <w:color w:val="1A1A1A"/>
                 <w:sz w:val="19"/>
               </w:rPr>
-              <w:t>-0.3873 mm/mm</w:t>
+              <w:t>-0.3914 mm/mm</w:t>
             </w:r>
           </w:p>
         </w:tc>
@@ -3519,7 +3519,7 @@
                 <w:color w:val="1A1A1A"/>
                 <w:sz w:val="19"/>
               </w:rPr>
-              <w:t>+0.0565 mm/mm</w:t>
+              <w:t>+0.0568 mm/mm</w:t>
             </w:r>
           </w:p>
         </w:tc>
@@ -3565,7 +3565,7 @@
                 <w:color w:val="1A1A1A"/>
                 <w:sz w:val="19"/>
               </w:rPr>
-              <w:t>-2.47°</w:t>
+              <w:t>-2.49°</w:t>
             </w:r>
           </w:p>
         </w:tc>
@@ -3609,7 +3609,7 @@
                 <w:color w:val="1A1A1A"/>
                 <w:sz w:val="19"/>
               </w:rPr>
-              <w:t>-0.56°</w:t>
+              <w:t>-0.57°</w:t>
             </w:r>
           </w:p>
         </w:tc>
@@ -3655,7 +3655,7 @@
                 <w:color w:val="1A1A1A"/>
                 <w:sz w:val="19"/>
               </w:rPr>
-              <w:t>25.4 to 44.8 mm</w:t>
+              <w:t>25.3 to 44.9 mm</w:t>
             </w:r>
           </w:p>
         </w:tc>
@@ -3790,7 +3790,7 @@
                 <w:color w:val="1A1A1A"/>
                 <w:sz w:val="19"/>
               </w:rPr>
-              <w:t>-0.63°  (static -1.50°)</w:t>
+              <w:t>-0.64°  (static -1.50°)</w:t>
             </w:r>
           </w:p>
         </w:tc>
@@ -3926,7 +3926,7 @@
                 <w:color w:val="1A1A1A"/>
                 <w:sz w:val="19"/>
               </w:rPr>
-              <w:t>-110.2 mm</w:t>
+              <w:t>-111.5 mm</w:t>
             </w:r>
           </w:p>
         </w:tc>
@@ -5915,7 +5915,7 @@
                 <w:color w:val="1A1A1A"/>
                 <w:sz w:val="19"/>
               </w:rPr>
-              <w:t>0.0409 °/mm</w:t>
+              <w:t>0.0411 °/mm</w:t>
             </w:r>
           </w:p>
         </w:tc>
@@ -6248,7 +6248,7 @@
                 <w:color w:val="1A1A1A"/>
                 <w:sz w:val="19"/>
               </w:rPr>
-              <w:t>-0.0409 °/mm</w:t>
+              <w:t>-0.0411 °/mm</w:t>
             </w:r>
           </w:p>
         </w:tc>
@@ -6294,7 +6294,7 @@
                 <w:color w:val="1A1A1A"/>
                 <w:sz w:val="19"/>
               </w:rPr>
-              <w:t>-0.4193 mm/mm</w:t>
+              <w:t>-0.4239 mm/mm</w:t>
             </w:r>
           </w:p>
         </w:tc>
@@ -6338,7 +6338,7 @@
                 <w:color w:val="1A1A1A"/>
                 <w:sz w:val="19"/>
               </w:rPr>
-              <w:t>+0.0917 mm/mm</w:t>
+              <w:t>+0.0922 mm/mm</w:t>
             </w:r>
           </w:p>
         </w:tc>
@@ -6474,7 +6474,7 @@
                 <w:color w:val="1A1A1A"/>
                 <w:sz w:val="19"/>
               </w:rPr>
-              <w:t>44.7 to 65.7 mm</w:t>
+              <w:t>44.5 to 65.7 mm</w:t>
             </w:r>
           </w:p>
         </w:tc>
@@ -6699,7 +6699,7 @@
                 <w:color w:val="1A1A1A"/>
                 <w:sz w:val="19"/>
               </w:rPr>
-              <w:t>54.3 mm  (design 55.0)</w:t>
+              <w:t>54.2 mm  (design 55.0)</w:t>
             </w:r>
           </w:p>
         </w:tc>
@@ -6745,7 +6745,7 @@
                 <w:color w:val="1A1A1A"/>
                 <w:sz w:val="19"/>
               </w:rPr>
-              <w:t>-70.3 mm</w:t>
+              <w:t>-71.1 mm</w:t>
             </w:r>
           </w:p>
         </w:tc>
@@ -6970,7 +6970,7 @@
                 <w:color w:val="1A1A1A"/>
                 <w:sz w:val="19"/>
               </w:rPr>
-              <w:t>1140.0 / 1480.0 mm</w:t>
+              <w:t>1360.0 / 1540.0 mm</w:t>
             </w:r>
           </w:p>
         </w:tc>
@@ -7016,7 +7016,7 @@
                 <w:color w:val="1A1A1A"/>
                 <w:sz w:val="19"/>
               </w:rPr>
-              <w:t>1160.0 / 1480.0 mm</w:t>
+              <w:t>1380.0 / 1540.0 mm</w:t>
             </w:r>
           </w:p>
         </w:tc>
@@ -7635,7 +7635,7 @@
                 <w:color w:val="1A1A1A"/>
                 <w:sz w:val="19"/>
               </w:rPr>
-              <w:t>-0.00011 °/mm</w:t>
+              <w:t>-0.00010 °/mm</w:t>
             </w:r>
           </w:p>
         </w:tc>
@@ -7725,7 +7725,7 @@
                 <w:color w:val="1A1A1A"/>
                 <w:sz w:val="19"/>
               </w:rPr>
-              <w:t>+0.171 / +0.162 °</w:t>
+              <w:t>+0.152 / +0.158 °</w:t>
             </w:r>
           </w:p>
         </w:tc>
@@ -7861,7 +7861,7 @@
                 <w:color w:val="1A1A1A"/>
                 <w:sz w:val="19"/>
               </w:rPr>
-              <w:t>27.00 / 38.07°</w:t>
+              <w:t>27.07 / 39.69°</w:t>
             </w:r>
           </w:p>
         </w:tc>
@@ -7905,7 +7905,7 @@
                 <w:color w:val="1A1A1A"/>
                 <w:sz w:val="19"/>
               </w:rPr>
-              <w:t>66.8 %</w:t>
+              <w:t>70.0 %</w:t>
             </w:r>
           </w:p>
         </w:tc>
@@ -7951,7 +7951,7 @@
                 <w:color w:val="1A1A1A"/>
                 <w:sz w:val="19"/>
               </w:rPr>
-              <w:t>9.78°</w:t>
+              <w:t>5.54°</w:t>
             </w:r>
           </w:p>
         </w:tc>
@@ -9302,10 +9302,10 @@
               <w:rPr>
                 <w:rFonts w:ascii="Calibri" w:hAnsi="Calibri"/>
                 <w:b w:val="0"/>
-                <w:color w:val="9E241C"/>
-                <w:sz w:val="19"/>
-              </w:rPr>
-              <w:t>FAIL</w:t>
+                <w:color w:val="26644A"/>
+                <w:sz w:val="19"/>
+              </w:rPr>
+              <w:t>OK</w:t>
             </w:r>
           </w:p>
         </w:tc>
@@ -9347,7 +9347,7 @@
                 <w:color w:val="1A1A1A"/>
                 <w:sz w:val="19"/>
               </w:rPr>
-              <w:t>554.21 mm</w:t>
+              <w:t>423.73 mm</w:t>
             </w:r>
           </w:p>
         </w:tc>
@@ -9436,7 +9436,7 @@
                 <w:color w:val="1A1A1A"/>
                 <w:sz w:val="19"/>
               </w:rPr>
-              <w:t>388.26 mm</w:t>
+              <w:t>383.60 mm</w:t>
             </w:r>
           </w:p>
         </w:tc>
@@ -9478,10 +9478,10 @@
               <w:rPr>
                 <w:rFonts w:ascii="Calibri" w:hAnsi="Calibri"/>
                 <w:b w:val="0"/>
-                <w:color w:val="9E241C"/>
-                <w:sz w:val="19"/>
-              </w:rPr>
-              <w:t>FAIL</w:t>
+                <w:color w:val="26644A"/>
+                <w:sz w:val="19"/>
+              </w:rPr>
+              <w:t>OK</w:t>
             </w:r>
           </w:p>
         </w:tc>
@@ -9523,7 +9523,7 @@
                 <w:color w:val="1A1A1A"/>
                 <w:sz w:val="19"/>
               </w:rPr>
-              <w:t>517.59 mm</w:t>
+              <w:t>386.13 mm</w:t>
             </w:r>
           </w:p>
         </w:tc>
@@ -9612,7 +9612,7 @@
                 <w:color w:val="1A1A1A"/>
                 <w:sz w:val="19"/>
               </w:rPr>
-              <w:t>356.50 mm</w:t>
+              <w:t>351.42 mm</w:t>
             </w:r>
           </w:p>
         </w:tc>
@@ -9917,7 +9917,7 @@
                 <w:color w:val="1A1A1A"/>
                 <w:sz w:val="19"/>
               </w:rPr>
-              <w:t>340.00 / 230.00 mm   (e/a 1.353)</w:t>
+              <w:t>180.00 / 90.00 mm   (e/a 1.000)</w:t>
             </w:r>
           </w:p>
         </w:tc>
@@ -9963,7 +9963,7 @@
                 <w:color w:val="1A1A1A"/>
                 <w:sz w:val="19"/>
               </w:rPr>
-              <w:t>320.00 / 220.00 mm   (e/a 1.375)</w:t>
+              <w:t>160.00 / 80.00 mm   (e/a 1.000)</w:t>
             </w:r>
           </w:p>
         </w:tc>
@@ -10944,7 +10944,7 @@
                 <w:color w:val="1A1A1A"/>
                 <w:sz w:val="19"/>
               </w:rPr>
-              <w:t>620.00</w:t>
+              <w:t>613.58</w:t>
             </w:r>
           </w:p>
         </w:tc>
@@ -11947,7 +11947,7 @@
                 <w:color w:val="1A1A1A"/>
                 <w:sz w:val="19"/>
               </w:rPr>
-              <w:t>-620.00</w:t>
+              <w:t>-613.58</w:t>
             </w:r>
           </w:p>
         </w:tc>
@@ -12225,7 +12225,7 @@
                 <w:color w:val="1A1A1A"/>
                 <w:sz w:val="19"/>
               </w:rPr>
-              <w:t>-1160.00</w:t>
+              <w:t>-1380.00</w:t>
             </w:r>
           </w:p>
         </w:tc>
@@ -12313,7 +12313,7 @@
                 <w:color w:val="1A1A1A"/>
                 <w:sz w:val="19"/>
               </w:rPr>
-              <w:t>-1480.00</w:t>
+              <w:t>-1540.00</w:t>
             </w:r>
           </w:p>
         </w:tc>
@@ -12489,7 +12489,7 @@
                 <w:color w:val="1A1A1A"/>
                 <w:sz w:val="19"/>
               </w:rPr>
-              <w:t>-1140.00</w:t>
+              <w:t>-1360.00</w:t>
             </w:r>
           </w:p>
         </w:tc>
@@ -12577,7 +12577,7 @@
                 <w:color w:val="1A1A1A"/>
                 <w:sz w:val="19"/>
               </w:rPr>
-              <w:t>-1480.00</w:t>
+              <w:t>-1540.00</w:t>
             </w:r>
           </w:p>
         </w:tc>
@@ -12950,7 +12950,7 @@
                 <w:color w:val="1A1A1A"/>
                 <w:sz w:val="19"/>
               </w:rPr>
-              <w:t>600.00</w:t>
+              <w:t>593.58</w:t>
             </w:r>
           </w:p>
         </w:tc>
@@ -13228,7 +13228,7 @@
                 <w:color w:val="1A1A1A"/>
                 <w:sz w:val="19"/>
               </w:rPr>
-              <w:t>-1160.00</w:t>
+              <w:t>-1380.00</w:t>
             </w:r>
           </w:p>
         </w:tc>
@@ -13316,7 +13316,7 @@
                 <w:color w:val="1A1A1A"/>
                 <w:sz w:val="19"/>
               </w:rPr>
-              <w:t>-1480.00</w:t>
+              <w:t>-1540.00</w:t>
             </w:r>
           </w:p>
         </w:tc>
@@ -13492,7 +13492,7 @@
                 <w:color w:val="1A1A1A"/>
                 <w:sz w:val="19"/>
               </w:rPr>
-              <w:t>-1140.00</w:t>
+              <w:t>-1360.00</w:t>
             </w:r>
           </w:p>
         </w:tc>
@@ -13580,7 +13580,7 @@
                 <w:color w:val="1A1A1A"/>
                 <w:sz w:val="19"/>
               </w:rPr>
-              <w:t>-1480.00</w:t>
+              <w:t>-1540.00</w:t>
             </w:r>
           </w:p>
         </w:tc>
@@ -13953,7 +13953,7 @@
                 <w:color w:val="1A1A1A"/>
                 <w:sz w:val="19"/>
               </w:rPr>
-              <w:t>-600.00</w:t>
+              <w:t>-593.58</w:t>
             </w:r>
           </w:p>
         </w:tc>
@@ -14100,7 +14100,7 @@
           <w:color w:val="9E241C"/>
           <w:sz w:val="18"/>
         </w:rPr>
-        <w:t>STATIC ALIGNMENT ENCODED HERE: camber +0.00°, toe +0.00° per side. CONTACT_PATCH sits directly below WHEEL_CENTER on all four corners, which is a zero-camber, zero-toe convention, while the rate and roll tables assume the design-intent static camber. Decide the convention once and apply it everywhere — see section 8.</w:t>
+        <w:t>STATIC ALIGNMENT ENCODED HERE: camber -1.50°, toe +0.00° per side. CONTACT_PATCH sits directly below WHEEL_CENTER on all four corners, which is a zero-camber, zero-toe convention, while the rate and roll tables assume the design-intent static camber. Decide the convention once and apply it everywhere — see section 8.</w:t>
       </w:r>
     </w:p>
     <w:p>

</xml_diff>

<commit_message>
once again trying a new suspension geometry, introducing anti-dive y offset and more driveshaft shift
</commit_message>
<xml_diff>
--- a/Geometry Summary/Hardpoints Suspensão 2027.docx
+++ b/Geometry Summary/Hardpoints Suspensão 2027.docx
@@ -54,7 +54,7 @@
           <w:color w:val="595959"/>
           <w:sz w:val="18"/>
         </w:rPr>
-        <w:t>Generated 2026-08-27 by scripts/build_summary_doc.py from sla_geometry.py and steering_geometry.py. Do not hand-edit: change the config in those scripts and re-run. This document supersedes "Hardpoints Suspensão 2027", whose rate tables predated the upright-rotation sign fix (commit 0e7e524) and whose force tables assumed a different weight distribution from its own roll-stiffness section.</w:t>
+        <w:t>Generated 2026-09-01 by scripts/build_summary_doc.py from sla_geometry.py and steering_geometry.py. Do not hand-edit: change the config in those scripts and re-run. This document supersedes "Hardpoints Suspensão 2027", whose rate tables predated the upright-rotation sign fix (commit 0e7e524) and whose force tables assumed a different weight distribution from its own roll-stiffness section.</w:t>
       </w:r>
     </w:p>
     <w:p>
@@ -548,20 +548,6 @@
           <w:sz w:val="18"/>
         </w:rPr>
         <w:t>Conversion: X_iso = −x_rearward, Y_iso = ±y_outboard, Z_iso = z. In ISO 8855 the rear axle is at NEGATIVE X and right-hand corners are at NEGATIVE Y.</w:t>
-      </w:r>
-    </w:p>
-    <w:p>
-      <w:pPr>
-        <w:spacing w:before="60" w:after="120"/>
-      </w:pPr>
-      <w:r>
-        <w:rPr>
-          <w:rFonts w:ascii="Calibri" w:hAnsi="Calibri"/>
-          <w:i w:val="0"/>
-          <w:color w:val="9E241C"/>
-          <w:sz w:val="18"/>
-        </w:rPr>
-        <w:t>OPEN: the rear tie rod is not synthesised by any script. steering_geometry.py covers the front axle only, so RL/RR TIE_ROD_IN and TIE_ROD_OUT are hand-entered points read from legacy_app/carro_formula_2027.csv. They are not regenerated, not bounds-checked and not covered by any test.</w:t>
       </w:r>
     </w:p>
     <w:p>
@@ -1857,7 +1843,7 @@
                 <w:color w:val="1A1A1A"/>
                 <w:sz w:val="19"/>
               </w:rPr>
-              <w:t>175.00</w:t>
+              <w:t>210.00</w:t>
             </w:r>
           </w:p>
         </w:tc>
@@ -1879,7 +1865,7 @@
                 <w:color w:val="1A1A1A"/>
                 <w:sz w:val="19"/>
               </w:rPr>
-              <w:t>308.58</w:t>
+              <w:t>316.01</w:t>
             </w:r>
           </w:p>
         </w:tc>
@@ -2065,7 +2051,7 @@
                 <w:color w:val="1A1A1A"/>
                 <w:sz w:val="19"/>
               </w:rPr>
-              <w:t>407.20 / 370.03 mm  (ratio 0.909)</w:t>
+              <w:t>407.20 / 334.25 mm  (ratio 0.821)</w:t>
             </w:r>
           </w:p>
         </w:tc>
@@ -2155,7 +2141,7 @@
                 <w:color w:val="1A1A1A"/>
                 <w:sz w:val="19"/>
               </w:rPr>
-              <w:t>191.20 mm</w:t>
+              <w:t>198.63 mm</w:t>
             </w:r>
           </w:p>
         </w:tc>
@@ -2942,7 +2928,7 @@
                 <w:color w:val="1A1A1A"/>
                 <w:sz w:val="19"/>
               </w:rPr>
-              <w:t>320 to 430</w:t>
+              <w:t>320 to 460</w:t>
             </w:r>
           </w:p>
         </w:tc>
@@ -3007,7 +2993,7 @@
                 <w:color w:val="1A1A1A"/>
                 <w:sz w:val="19"/>
               </w:rPr>
-              <w:t>0.909</w:t>
+              <w:t>0.821</w:t>
             </w:r>
           </w:p>
         </w:tc>
@@ -3096,7 +3082,7 @@
                 <w:color w:val="1A1A1A"/>
                 <w:sz w:val="19"/>
               </w:rPr>
-              <w:t>0.0384 °/mm</w:t>
+              <w:t>0.0386 °/mm</w:t>
             </w:r>
           </w:p>
         </w:tc>
@@ -3429,7 +3415,7 @@
                 <w:color w:val="1A1A1A"/>
                 <w:sz w:val="19"/>
               </w:rPr>
-              <w:t>-0.0384 °/mm</w:t>
+              <w:t>-0.0386 °/mm</w:t>
             </w:r>
           </w:p>
         </w:tc>
@@ -3475,7 +3461,7 @@
                 <w:color w:val="1A1A1A"/>
                 <w:sz w:val="19"/>
               </w:rPr>
-              <w:t>-0.3914 mm/mm</w:t>
+              <w:t>-0.3106 mm/mm</w:t>
             </w:r>
           </w:p>
         </w:tc>
@@ -3519,7 +3505,7 @@
                 <w:color w:val="1A1A1A"/>
                 <w:sz w:val="19"/>
               </w:rPr>
-              <w:t>+0.0568 mm/mm</w:t>
+              <w:t>+0.0574 mm/mm</w:t>
             </w:r>
           </w:p>
         </w:tc>
@@ -3565,7 +3551,7 @@
                 <w:color w:val="1A1A1A"/>
                 <w:sz w:val="19"/>
               </w:rPr>
-              <w:t>-2.49°</w:t>
+              <w:t>-2.52°</w:t>
             </w:r>
           </w:p>
         </w:tc>
@@ -3609,7 +3595,7 @@
                 <w:color w:val="1A1A1A"/>
                 <w:sz w:val="19"/>
               </w:rPr>
-              <w:t>-0.57°</w:t>
+              <w:t>-0.58°</w:t>
             </w:r>
           </w:p>
         </w:tc>
@@ -3655,7 +3641,7 @@
                 <w:color w:val="1A1A1A"/>
                 <w:sz w:val="19"/>
               </w:rPr>
-              <w:t>25.3 to 44.9 mm</w:t>
+              <w:t>27.9 to 43.4 mm</w:t>
             </w:r>
           </w:p>
         </w:tc>
@@ -3790,7 +3776,7 @@
                 <w:color w:val="1A1A1A"/>
                 <w:sz w:val="19"/>
               </w:rPr>
-              <w:t>-0.64°  (static -1.50°)</w:t>
+              <w:t>-0.65°  (static -1.50°)</w:t>
             </w:r>
           </w:p>
         </w:tc>
@@ -3880,7 +3866,7 @@
                 <w:color w:val="1A1A1A"/>
                 <w:sz w:val="19"/>
               </w:rPr>
-              <w:t>33.9 mm  (design 35.0)</w:t>
+              <w:t>34.9 mm  (design 35.0)</w:t>
             </w:r>
           </w:p>
         </w:tc>
@@ -3926,7 +3912,7 @@
                 <w:color w:val="1A1A1A"/>
                 <w:sz w:val="19"/>
               </w:rPr>
-              <w:t>-111.5 mm</w:t>
+              <w:t>-86.9 mm</w:t>
             </w:r>
           </w:p>
         </w:tc>
@@ -4241,7 +4227,7 @@
                 <w:color w:val="1A1A1A"/>
                 <w:sz w:val="19"/>
               </w:rPr>
-              <w:t>see section 5 — measured as built (target ≤ 1.5)</w:t>
+              <w:t>see section 5 — measured as built (target ≤ 2)</w:t>
             </w:r>
           </w:p>
         </w:tc>
@@ -4287,7 +4273,7 @@
                 <w:color w:val="1A1A1A"/>
                 <w:sz w:val="19"/>
               </w:rPr>
-              <w:t>0.00 %   (target 0 to 30)</w:t>
+              <w:t>7.50 %   (target 0 to 30)</w:t>
             </w:r>
           </w:p>
         </w:tc>
@@ -4297,20 +4283,6 @@
       <w:pPr>
         <w:spacing w:after="0"/>
       </w:pPr>
-    </w:p>
-    <w:p>
-      <w:pPr>
-        <w:spacing w:before="60" w:after="120"/>
-      </w:pPr>
-      <w:r>
-        <w:rPr>
-          <w:rFonts w:ascii="Calibri" w:hAnsi="Calibri"/>
-          <w:i/>
-          <w:color w:val="595959"/>
-          <w:sz w:val="18"/>
-        </w:rPr>
-        <w:t>All pivot axes are exactly horizontal, so the side-view instant centre is at infinity and the anti-feature is identically zero — not approximately zero. That is a design decision to defend, not a check that happened to pass.</w:t>
-      </w:r>
     </w:p>
     <w:p>
       <w:pPr>
@@ -4676,7 +4648,7 @@
                 <w:color w:val="1A1A1A"/>
                 <w:sz w:val="19"/>
               </w:rPr>
-              <w:t>175.00</w:t>
+              <w:t>210.00</w:t>
             </w:r>
           </w:p>
         </w:tc>
@@ -4698,7 +4670,7 @@
                 <w:color w:val="1A1A1A"/>
                 <w:sz w:val="19"/>
               </w:rPr>
-              <w:t>321.91</w:t>
+              <w:t>328.85</w:t>
             </w:r>
           </w:p>
         </w:tc>
@@ -4884,7 +4856,7 @@
                 <w:color w:val="1A1A1A"/>
                 <w:sz w:val="19"/>
               </w:rPr>
-              <w:t>383.60 / 351.42 mm  (ratio 0.916)</w:t>
+              <w:t>383.60 / 315.74 mm  (ratio 0.823)</w:t>
             </w:r>
           </w:p>
         </w:tc>
@@ -4974,7 +4946,7 @@
                 <w:color w:val="1A1A1A"/>
                 <w:sz w:val="19"/>
               </w:rPr>
-              <w:t>192.38 mm</w:t>
+              <w:t>199.32 mm</w:t>
             </w:r>
           </w:p>
         </w:tc>
@@ -5761,7 +5733,7 @@
                 <w:color w:val="1A1A1A"/>
                 <w:sz w:val="19"/>
               </w:rPr>
-              <w:t>320 to 430</w:t>
+              <w:t>320 to 460</w:t>
             </w:r>
           </w:p>
         </w:tc>
@@ -5826,7 +5798,7 @@
                 <w:color w:val="1A1A1A"/>
                 <w:sz w:val="19"/>
               </w:rPr>
-              <w:t>0.916</w:t>
+              <w:t>0.823</w:t>
             </w:r>
           </w:p>
         </w:tc>
@@ -6294,7 +6266,7 @@
                 <w:color w:val="1A1A1A"/>
                 <w:sz w:val="19"/>
               </w:rPr>
-              <w:t>-0.4239 mm/mm</w:t>
+              <w:t>-0.3380 mm/mm</w:t>
             </w:r>
           </w:p>
         </w:tc>
@@ -6384,7 +6356,7 @@
                 <w:color w:val="1A1A1A"/>
                 <w:sz w:val="19"/>
               </w:rPr>
-              <w:t>-2.54°</w:t>
+              <w:t>-2.56°</w:t>
             </w:r>
           </w:p>
         </w:tc>
@@ -6428,7 +6400,7 @@
                 <w:color w:val="1A1A1A"/>
                 <w:sz w:val="19"/>
               </w:rPr>
-              <w:t>-0.49°</w:t>
+              <w:t>-0.51°</w:t>
             </w:r>
           </w:p>
         </w:tc>
@@ -6474,7 +6446,7 @@
                 <w:color w:val="1A1A1A"/>
                 <w:sz w:val="19"/>
               </w:rPr>
-              <w:t>44.5 to 65.7 mm</w:t>
+              <w:t>46.8 to 63.7 mm</w:t>
             </w:r>
           </w:p>
         </w:tc>
@@ -6609,7 +6581,7 @@
                 <w:color w:val="1A1A1A"/>
                 <w:sz w:val="19"/>
               </w:rPr>
-              <w:t>-0.65°  (static -1.50°)</w:t>
+              <w:t>-0.66°  (static -1.50°)</w:t>
             </w:r>
           </w:p>
         </w:tc>
@@ -6655,7 +6627,7 @@
                 <w:color w:val="1A1A1A"/>
                 <w:sz w:val="19"/>
               </w:rPr>
-              <w:t>-2.36°</w:t>
+              <w:t>-2.37°</w:t>
             </w:r>
           </w:p>
         </w:tc>
@@ -6699,7 +6671,7 @@
                 <w:color w:val="1A1A1A"/>
                 <w:sz w:val="19"/>
               </w:rPr>
-              <w:t>54.2 mm  (design 55.0)</w:t>
+              <w:t>54.6 mm  (design 55.0)</w:t>
             </w:r>
           </w:p>
         </w:tc>
@@ -6745,7 +6717,7 @@
                 <w:color w:val="1A1A1A"/>
                 <w:sz w:val="19"/>
               </w:rPr>
-              <w:t>-71.1 mm</w:t>
+              <w:t>-56.3 mm</w:t>
             </w:r>
           </w:p>
         </w:tc>
@@ -6970,7 +6942,7 @@
                 <w:color w:val="1A1A1A"/>
                 <w:sz w:val="19"/>
               </w:rPr>
-              <w:t>1360.0 / 1540.0 mm</w:t>
+              <w:t>1300.0 / 1460.0 mm</w:t>
             </w:r>
           </w:p>
         </w:tc>
@@ -7016,7 +6988,7 @@
                 <w:color w:val="1A1A1A"/>
                 <w:sz w:val="19"/>
               </w:rPr>
-              <w:t>1380.0 / 1540.0 mm</w:t>
+              <w:t>1300.0 / 1460.0 mm</w:t>
             </w:r>
           </w:p>
         </w:tc>
@@ -7060,7 +7032,7 @@
                 <w:color w:val="1A1A1A"/>
                 <w:sz w:val="19"/>
               </w:rPr>
-              <w:t>see section 5 — measured as built (target ≤ 1.5)</w:t>
+              <w:t>see section 5 — measured as built (target ≤ 2)</w:t>
             </w:r>
           </w:p>
         </w:tc>
@@ -7438,7 +7410,7 @@
                 <w:color w:val="1A1A1A"/>
                 <w:sz w:val="19"/>
               </w:rPr>
-              <w:t>340.79 mm</w:t>
+              <w:t>340.84 mm</w:t>
             </w:r>
           </w:p>
         </w:tc>
@@ -7484,7 +7456,7 @@
                 <w:color w:val="1A1A1A"/>
                 <w:sz w:val="19"/>
               </w:rPr>
-              <w:t>30.0, 158.3 mm</w:t>
+              <w:t>30.0, 157.4 mm</w:t>
             </w:r>
           </w:p>
         </w:tc>
@@ -7635,7 +7607,7 @@
                 <w:color w:val="1A1A1A"/>
                 <w:sz w:val="19"/>
               </w:rPr>
-              <w:t>-0.00010 °/mm</w:t>
+              <w:t>-0.00000 °/mm</w:t>
             </w:r>
           </w:p>
         </w:tc>
@@ -7681,7 +7653,7 @@
                 <w:color w:val="1A1A1A"/>
                 <w:sz w:val="19"/>
               </w:rPr>
-              <w:t>+0.00021 °/mm</w:t>
+              <w:t>+0.00000 °/mm</w:t>
             </w:r>
           </w:p>
         </w:tc>
@@ -7725,7 +7697,7 @@
                 <w:color w:val="1A1A1A"/>
                 <w:sz w:val="19"/>
               </w:rPr>
-              <w:t>+0.152 / +0.158 °</w:t>
+              <w:t>+0.158 / +0.160 °</w:t>
             </w:r>
           </w:p>
         </w:tc>
@@ -7861,7 +7833,7 @@
                 <w:color w:val="1A1A1A"/>
                 <w:sz w:val="19"/>
               </w:rPr>
-              <w:t>27.07 / 39.69°</w:t>
+              <w:t>27.06 / 39.65°</w:t>
             </w:r>
           </w:p>
         </w:tc>
@@ -7951,7 +7923,7 @@
                 <w:color w:val="1A1A1A"/>
                 <w:sz w:val="19"/>
               </w:rPr>
-              <w:t>5.54°</w:t>
+              <w:t>5.51°</w:t>
             </w:r>
           </w:p>
         </w:tc>
@@ -8176,7 +8148,7 @@
                 <w:color w:val="1A1A1A"/>
                 <w:sz w:val="19"/>
               </w:rPr>
-              <w:t>608.4 N</w:t>
+              <w:t>608.1 N</w:t>
             </w:r>
           </w:p>
         </w:tc>
@@ -8520,7 +8492,7 @@
                 <w:color w:val="1A1A1A"/>
                 <w:sz w:val="19"/>
               </w:rPr>
-              <w:t>320 to 430</w:t>
+              <w:t>320 to 460</w:t>
             </w:r>
           </w:p>
         </w:tc>
@@ -8541,10 +8513,10 @@
               <w:rPr>
                 <w:rFonts w:ascii="Calibri" w:hAnsi="Calibri"/>
                 <w:b w:val="0"/>
-                <w:color w:val="9E241C"/>
-                <w:sz w:val="19"/>
-              </w:rPr>
-              <w:t>FAIL</w:t>
+                <w:color w:val="26644A"/>
+                <w:sz w:val="19"/>
+              </w:rPr>
+              <w:t>OK</w:t>
             </w:r>
           </w:p>
         </w:tc>
@@ -8610,7 +8582,7 @@
                 <w:color w:val="1A1A1A"/>
                 <w:sz w:val="19"/>
               </w:rPr>
-              <w:t>320 to 430</w:t>
+              <w:t>320 to 460</w:t>
             </w:r>
           </w:p>
         </w:tc>
@@ -8675,7 +8647,7 @@
                 <w:color w:val="1A1A1A"/>
                 <w:sz w:val="19"/>
               </w:rPr>
-              <w:t>392.96 mm</w:t>
+              <w:t>358.42 mm</w:t>
             </w:r>
           </w:p>
         </w:tc>
@@ -8696,7 +8668,7 @@
                 <w:color w:val="1A1A1A"/>
                 <w:sz w:val="19"/>
               </w:rPr>
-              <w:t>320 to 430</w:t>
+              <w:t>320 to 460</w:t>
             </w:r>
           </w:p>
         </w:tc>
@@ -8764,7 +8736,7 @@
                 <w:color w:val="1A1A1A"/>
                 <w:sz w:val="19"/>
               </w:rPr>
-              <w:t>385.39 mm</w:t>
+              <w:t>352.34 mm</w:t>
             </w:r>
           </w:p>
         </w:tc>
@@ -8786,7 +8758,7 @@
                 <w:color w:val="1A1A1A"/>
                 <w:sz w:val="19"/>
               </w:rPr>
-              <w:t>320 to 430</w:t>
+              <w:t>320 to 460</w:t>
             </w:r>
           </w:p>
         </w:tc>
@@ -9159,7 +9131,7 @@
                 <w:color w:val="1A1A1A"/>
                 <w:sz w:val="19"/>
               </w:rPr>
-              <w:t>340.79 mm</w:t>
+              <w:t>340.84 mm</w:t>
             </w:r>
           </w:p>
         </w:tc>
@@ -9347,7 +9319,7 @@
                 <w:color w:val="1A1A1A"/>
                 <w:sz w:val="19"/>
               </w:rPr>
-              <w:t>423.73 mm</w:t>
+              <w:t>452.49 mm</w:t>
             </w:r>
           </w:p>
         </w:tc>
@@ -9368,7 +9340,7 @@
                 <w:color w:val="1A1A1A"/>
                 <w:sz w:val="19"/>
               </w:rPr>
-              <w:t>320 to 430</w:t>
+              <w:t>320 to 460</w:t>
             </w:r>
           </w:p>
         </w:tc>
@@ -9436,7 +9408,7 @@
                 <w:color w:val="1A1A1A"/>
                 <w:sz w:val="19"/>
               </w:rPr>
-              <w:t>383.60 mm</w:t>
+              <w:t>391.85 mm</w:t>
             </w:r>
           </w:p>
         </w:tc>
@@ -9458,7 +9430,7 @@
                 <w:color w:val="1A1A1A"/>
                 <w:sz w:val="19"/>
               </w:rPr>
-              <w:t>320 to 430</w:t>
+              <w:t>320 to 460</w:t>
             </w:r>
           </w:p>
         </w:tc>
@@ -9523,7 +9495,7 @@
                 <w:color w:val="1A1A1A"/>
                 <w:sz w:val="19"/>
               </w:rPr>
-              <w:t>386.13 mm</w:t>
+              <w:t>396.60 mm</w:t>
             </w:r>
           </w:p>
         </w:tc>
@@ -9544,7 +9516,7 @@
                 <w:color w:val="1A1A1A"/>
                 <w:sz w:val="19"/>
               </w:rPr>
-              <w:t>320 to 430</w:t>
+              <w:t>320 to 460</w:t>
             </w:r>
           </w:p>
         </w:tc>
@@ -9612,7 +9584,7 @@
                 <w:color w:val="1A1A1A"/>
                 <w:sz w:val="19"/>
               </w:rPr>
-              <w:t>351.42 mm</w:t>
+              <w:t>325.71 mm</w:t>
             </w:r>
           </w:p>
         </w:tc>
@@ -9634,7 +9606,7 @@
                 <w:color w:val="1A1A1A"/>
                 <w:sz w:val="19"/>
               </w:rPr>
-              <w:t>320 to 430</w:t>
+              <w:t>320 to 460</w:t>
             </w:r>
           </w:p>
         </w:tc>
@@ -9917,7 +9889,7 @@
                 <w:color w:val="1A1A1A"/>
                 <w:sz w:val="19"/>
               </w:rPr>
-              <w:t>180.00 / 90.00 mm   (e/a 1.000)</w:t>
+              <w:t>160.00 / 160.00 mm   (e/a 2.000)</w:t>
             </w:r>
           </w:p>
         </w:tc>
@@ -9963,7 +9935,7 @@
                 <w:color w:val="1A1A1A"/>
                 <w:sz w:val="19"/>
               </w:rPr>
-              <w:t>160.00 / 80.00 mm   (e/a 1.000)</w:t>
+              <w:t>160.00 / 160.00 mm   (e/a 2.000)</w:t>
             </w:r>
           </w:p>
         </w:tc>
@@ -10007,7 +9979,7 @@
                 <w:color w:val="1A1A1A"/>
                 <w:sz w:val="19"/>
               </w:rPr>
-              <w:t>364.59 mm</w:t>
+              <w:t>371.37 mm</w:t>
             </w:r>
           </w:p>
         </w:tc>
@@ -10240,7 +10212,7 @@
                 <w:color w:val="1A1A1A"/>
                 <w:sz w:val="19"/>
               </w:rPr>
-              <w:t>175.00</w:t>
+              <w:t>210.00</w:t>
             </w:r>
           </w:p>
         </w:tc>
@@ -10261,7 +10233,7 @@
                 <w:color w:val="1A1A1A"/>
                 <w:sz w:val="19"/>
               </w:rPr>
-              <w:t>308.58</w:t>
+              <w:t>321.66</w:t>
             </w:r>
           </w:p>
         </w:tc>
@@ -10329,7 +10301,7 @@
                 <w:color w:val="1A1A1A"/>
                 <w:sz w:val="19"/>
               </w:rPr>
-              <w:t>175.00</w:t>
+              <w:t>210.00</w:t>
             </w:r>
           </w:p>
         </w:tc>
@@ -10351,7 +10323,7 @@
                 <w:color w:val="1A1A1A"/>
                 <w:sz w:val="19"/>
               </w:rPr>
-              <w:t>308.58</w:t>
+              <w:t>310.36</w:t>
             </w:r>
           </w:p>
         </w:tc>
@@ -10789,7 +10761,7 @@
                 <w:color w:val="1A1A1A"/>
                 <w:sz w:val="19"/>
               </w:rPr>
-              <w:t>158.30</w:t>
+              <w:t>157.39</w:t>
             </w:r>
           </w:p>
         </w:tc>
@@ -11243,7 +11215,7 @@
                 <w:color w:val="1A1A1A"/>
                 <w:sz w:val="19"/>
               </w:rPr>
-              <w:t>-175.00</w:t>
+              <w:t>-210.00</w:t>
             </w:r>
           </w:p>
         </w:tc>
@@ -11264,7 +11236,7 @@
                 <w:color w:val="1A1A1A"/>
                 <w:sz w:val="19"/>
               </w:rPr>
-              <w:t>308.58</w:t>
+              <w:t>321.66</w:t>
             </w:r>
           </w:p>
         </w:tc>
@@ -11332,7 +11304,7 @@
                 <w:color w:val="1A1A1A"/>
                 <w:sz w:val="19"/>
               </w:rPr>
-              <w:t>-175.00</w:t>
+              <w:t>-210.00</w:t>
             </w:r>
           </w:p>
         </w:tc>
@@ -11354,7 +11326,7 @@
                 <w:color w:val="1A1A1A"/>
                 <w:sz w:val="19"/>
               </w:rPr>
-              <w:t>308.58</w:t>
+              <w:t>310.36</w:t>
             </w:r>
           </w:p>
         </w:tc>
@@ -11792,7 +11764,7 @@
                 <w:color w:val="1A1A1A"/>
                 <w:sz w:val="19"/>
               </w:rPr>
-              <w:t>158.30</w:t>
+              <w:t>157.39</w:t>
             </w:r>
           </w:p>
         </w:tc>
@@ -12225,7 +12197,7 @@
                 <w:color w:val="1A1A1A"/>
                 <w:sz w:val="19"/>
               </w:rPr>
-              <w:t>-1380.00</w:t>
+              <w:t>-1300.00</w:t>
             </w:r>
           </w:p>
         </w:tc>
@@ -12246,7 +12218,7 @@
                 <w:color w:val="1A1A1A"/>
                 <w:sz w:val="19"/>
               </w:rPr>
-              <w:t>175.00</w:t>
+              <w:t>210.00</w:t>
             </w:r>
           </w:p>
         </w:tc>
@@ -12267,7 +12239,7 @@
                 <w:color w:val="1A1A1A"/>
                 <w:sz w:val="19"/>
               </w:rPr>
-              <w:t>321.91</w:t>
+              <w:t>328.85</w:t>
             </w:r>
           </w:p>
         </w:tc>
@@ -12313,7 +12285,7 @@
                 <w:color w:val="1A1A1A"/>
                 <w:sz w:val="19"/>
               </w:rPr>
-              <w:t>-1540.00</w:t>
+              <w:t>-1460.00</w:t>
             </w:r>
           </w:p>
         </w:tc>
@@ -12335,7 +12307,7 @@
                 <w:color w:val="1A1A1A"/>
                 <w:sz w:val="19"/>
               </w:rPr>
-              <w:t>175.00</w:t>
+              <w:t>210.00</w:t>
             </w:r>
           </w:p>
         </w:tc>
@@ -12357,7 +12329,7 @@
                 <w:color w:val="1A1A1A"/>
                 <w:sz w:val="19"/>
               </w:rPr>
-              <w:t>321.91</w:t>
+              <w:t>328.85</w:t>
             </w:r>
           </w:p>
         </w:tc>
@@ -12489,7 +12461,7 @@
                 <w:color w:val="1A1A1A"/>
                 <w:sz w:val="19"/>
               </w:rPr>
-              <w:t>-1360.00</w:t>
+              <w:t>-1300.00</w:t>
             </w:r>
           </w:p>
         </w:tc>
@@ -12577,7 +12549,7 @@
                 <w:color w:val="1A1A1A"/>
                 <w:sz w:val="19"/>
               </w:rPr>
-              <w:t>-1540.00</w:t>
+              <w:t>-1460.00</w:t>
             </w:r>
           </w:p>
         </w:tc>
@@ -12753,7 +12725,7 @@
                 <w:color w:val="1A1A1A"/>
                 <w:sz w:val="19"/>
               </w:rPr>
-              <w:t>-1480.00</w:t>
+              <w:t>-1460.00</w:t>
             </w:r>
           </w:p>
         </w:tc>
@@ -13228,7 +13200,7 @@
                 <w:color w:val="1A1A1A"/>
                 <w:sz w:val="19"/>
               </w:rPr>
-              <w:t>-1380.00</w:t>
+              <w:t>-1300.00</w:t>
             </w:r>
           </w:p>
         </w:tc>
@@ -13249,7 +13221,7 @@
                 <w:color w:val="1A1A1A"/>
                 <w:sz w:val="19"/>
               </w:rPr>
-              <w:t>-175.00</w:t>
+              <w:t>-210.00</w:t>
             </w:r>
           </w:p>
         </w:tc>
@@ -13270,7 +13242,7 @@
                 <w:color w:val="1A1A1A"/>
                 <w:sz w:val="19"/>
               </w:rPr>
-              <w:t>321.91</w:t>
+              <w:t>328.85</w:t>
             </w:r>
           </w:p>
         </w:tc>
@@ -13316,7 +13288,7 @@
                 <w:color w:val="1A1A1A"/>
                 <w:sz w:val="19"/>
               </w:rPr>
-              <w:t>-1540.00</w:t>
+              <w:t>-1460.00</w:t>
             </w:r>
           </w:p>
         </w:tc>
@@ -13338,7 +13310,7 @@
                 <w:color w:val="1A1A1A"/>
                 <w:sz w:val="19"/>
               </w:rPr>
-              <w:t>-175.00</w:t>
+              <w:t>-210.00</w:t>
             </w:r>
           </w:p>
         </w:tc>
@@ -13360,7 +13332,7 @@
                 <w:color w:val="1A1A1A"/>
                 <w:sz w:val="19"/>
               </w:rPr>
-              <w:t>321.91</w:t>
+              <w:t>328.85</w:t>
             </w:r>
           </w:p>
         </w:tc>
@@ -13492,7 +13464,7 @@
                 <w:color w:val="1A1A1A"/>
                 <w:sz w:val="19"/>
               </w:rPr>
-              <w:t>-1360.00</w:t>
+              <w:t>-1300.00</w:t>
             </w:r>
           </w:p>
         </w:tc>
@@ -13580,7 +13552,7 @@
                 <w:color w:val="1A1A1A"/>
                 <w:sz w:val="19"/>
               </w:rPr>
-              <w:t>-1540.00</w:t>
+              <w:t>-1460.00</w:t>
             </w:r>
           </w:p>
         </w:tc>
@@ -13756,7 +13728,7 @@
                 <w:color w:val="1A1A1A"/>
                 <w:sz w:val="19"/>
               </w:rPr>
-              <w:t>-1480.00</w:t>
+              <w:t>-1460.00</w:t>
             </w:r>
           </w:p>
         </w:tc>
@@ -15002,20 +14974,6 @@
           <w:sz w:val="18"/>
         </w:rPr>
         <w:t>The front mass fraction is an unusual value for a rear-drive car and it drives both the roll-stiffness requirement and every leg force. Confirm it before the chassis is sized against it.</w:t>
-      </w:r>
-    </w:p>
-    <w:p>
-      <w:pPr>
-        <w:spacing w:before="60" w:after="120"/>
-      </w:pPr>
-      <w:r>
-        <w:rPr>
-          <w:rFonts w:ascii="Calibri" w:hAnsi="Calibri"/>
-          <w:i w:val="0"/>
-          <w:color w:val="595959"/>
-          <w:sz w:val="18"/>
-        </w:rPr>
-        <w:t>The rear tie rod has no synthesis script and no test.</w:t>
       </w:r>
     </w:p>
     <w:p>

</xml_diff>

<commit_message>
Fixing weight bias 55% to the rear
</commit_message>
<xml_diff>
--- a/Geometry Summary/Hardpoints Suspensão 2027.docx
+++ b/Geometry Summary/Hardpoints Suspensão 2027.docx
@@ -813,7 +813,7 @@
                 <w:color w:val="1A1A1A"/>
                 <w:sz w:val="19"/>
               </w:rPr>
-              <w:t>320.0 mm / 693.0 mm aft of the front axle</w:t>
+              <w:t>320.0 mm / 847.0 mm aft of the front axle</w:t>
             </w:r>
           </w:p>
         </w:tc>
@@ -857,7 +857,7 @@
                 <w:color w:val="1A1A1A"/>
                 <w:sz w:val="19"/>
               </w:rPr>
-              <w:t>55.0 %</w:t>
+              <w:t>45.0 %</w:t>
             </w:r>
           </w:p>
         </w:tc>
@@ -903,7 +903,7 @@
                 <w:color w:val="1A1A1A"/>
                 <w:sz w:val="19"/>
               </w:rPr>
-              <w:t>44.0 mm</w:t>
+              <w:t>46.0 mm</w:t>
             </w:r>
           </w:p>
         </w:tc>
@@ -947,7 +947,7 @@
                 <w:color w:val="1A1A1A"/>
                 <w:sz w:val="19"/>
               </w:rPr>
-              <w:t>276.0 mm</w:t>
+              <w:t>274.0 mm</w:t>
             </w:r>
           </w:p>
         </w:tc>
@@ -1037,7 +1037,7 @@
                 <w:color w:val="1A1A1A"/>
                 <w:sz w:val="19"/>
               </w:rPr>
-              <w:t>731.0 N·m/°</w:t>
+              <w:t>725.7 N·m/°</w:t>
             </w:r>
           </w:p>
         </w:tc>
@@ -1083,7 +1083,7 @@
                 <w:color w:val="1A1A1A"/>
                 <w:sz w:val="19"/>
               </w:rPr>
-              <w:t>2193 (min) / 3655 (target) N·m/°</w:t>
+              <w:t>2177 (min) / 3629 (target) N·m/°</w:t>
             </w:r>
           </w:p>
         </w:tc>
@@ -8072,7 +8072,7 @@
                 <w:color w:val="1A1A1A"/>
                 <w:sz w:val="19"/>
               </w:rPr>
-              <w:t>849.8 N</w:t>
+              <w:t>695.3 N</w:t>
             </w:r>
           </w:p>
         </w:tc>
@@ -8118,7 +8118,7 @@
                 <w:color w:val="1A1A1A"/>
                 <w:sz w:val="19"/>
               </w:rPr>
-              <w:t>22.27 N·m</w:t>
+              <w:t>18.22 N·m</w:t>
             </w:r>
           </w:p>
         </w:tc>
@@ -8162,7 +8162,7 @@
                 <w:color w:val="1A1A1A"/>
                 <w:sz w:val="19"/>
               </w:rPr>
-              <w:t>608.1 N</w:t>
+              <w:t>497.6 N</w:t>
             </w:r>
           </w:p>
         </w:tc>
@@ -8208,7 +8208,7 @@
                 <w:color w:val="1A1A1A"/>
                 <w:sz w:val="19"/>
               </w:rPr>
-              <w:t>9.73 N·m</w:t>
+              <w:t>7.96 N·m</w:t>
             </w:r>
           </w:p>
         </w:tc>
@@ -8252,7 +8252,7 @@
                 <w:color w:val="1A1A1A"/>
                 <w:sz w:val="19"/>
               </w:rPr>
-              <w:t>69.5 N</w:t>
+              <w:t>56.9 N</w:t>
             </w:r>
           </w:p>
         </w:tc>
@@ -14306,7 +14306,7 @@
                 <w:color w:val="1A1A1A"/>
                 <w:sz w:val="19"/>
               </w:rPr>
-              <w:t>55.0 %</w:t>
+              <w:t>45.0 %</w:t>
             </w:r>
           </w:p>
         </w:tc>
@@ -14617,7 +14617,7 @@
                 <w:color w:val="1A1A1A"/>
                 <w:sz w:val="19"/>
               </w:rPr>
-              <w:t>Lateral load transfer distribution</w:t>
+              <w:t>Lateral load transfer distribution (front share)</w:t>
             </w:r>
           </w:p>
         </w:tc>
@@ -14638,7 +14638,7 @@
                 <w:color w:val="1A1A1A"/>
                 <w:sz w:val="19"/>
               </w:rPr>
-              <w:t>0.55</w:t>
+              <w:t>0.45</w:t>
             </w:r>
           </w:p>
         </w:tc>
@@ -14669,6 +14669,385 @@
       <w:pPr>
         <w:spacing w:after="0"/>
       </w:pPr>
+    </w:p>
+    <w:p>
+      <w:pPr>
+        <w:spacing w:before="60" w:after="120"/>
+      </w:pPr>
+      <w:r>
+        <w:rPr>
+          <w:rFonts w:ascii="Calibri" w:hAnsi="Calibri"/>
+          <w:i w:val="0"/>
+          <w:color w:val="595959"/>
+          <w:sz w:val="18"/>
+        </w:rPr>
+        <w:t>LLTD 0.45 against a front mass fraction of 0.45 makes lateral transfer proportional to axle load, so it introduces no balance shift of its own. That is a neutral BASELINE, not a tuned value — the balance target that would justify tuning away from it needs tyre data the team does not have.</w:t>
+      </w:r>
+    </w:p>
+    <w:tbl>
+      <w:tblPr>
+        <w:tblStyle w:val="TableGrid"/>
+        <w:tblW w:type="auto" w:w="0"/>
+        <w:jc w:val="left"/>
+        <w:tblLook w:firstColumn="1" w:firstRow="1" w:lastColumn="0" w:lastRow="0" w:noHBand="0" w:noVBand="1" w:val="04A0"/>
+      </w:tblPr>
+      <w:tblGrid>
+        <w:gridCol w:w="1987"/>
+        <w:gridCol w:w="1987"/>
+        <w:gridCol w:w="1987"/>
+        <w:gridCol w:w="1987"/>
+        <w:gridCol w:w="1987"/>
+      </w:tblGrid>
+      <w:tr>
+        <w:tc>
+          <w:tcPr>
+            <w:tcW w:type="dxa" w:w="1440"/>
+            <w:shd w:val="clear" w:color="auto" w:fill="1F3864"/>
+          </w:tcPr>
+          <w:p>
+            <w:pPr>
+              <w:spacing w:before="40" w:after="40"/>
+              <w:jc w:val="left"/>
+            </w:pPr>
+            <w:r/>
+            <w:r>
+              <w:rPr>
+                <w:rFonts w:ascii="Calibri" w:hAnsi="Calibri"/>
+                <w:b/>
+                <w:color w:val="FFFFFF"/>
+                <w:sz w:val="18"/>
+              </w:rPr>
+              <w:t>Axle</w:t>
+            </w:r>
+          </w:p>
+        </w:tc>
+        <w:tc>
+          <w:tcPr>
+            <w:tcW w:type="dxa" w:w="2160"/>
+            <w:shd w:val="clear" w:color="auto" w:fill="1F3864"/>
+          </w:tcPr>
+          <w:p>
+            <w:pPr>
+              <w:spacing w:before="40" w:after="40"/>
+              <w:jc w:val="right"/>
+            </w:pPr>
+            <w:r/>
+            <w:r>
+              <w:rPr>
+                <w:rFonts w:ascii="Calibri" w:hAnsi="Calibri"/>
+                <w:b/>
+                <w:color w:val="FFFFFF"/>
+                <w:sz w:val="18"/>
+              </w:rPr>
+              <w:t>Static / wheel</w:t>
+            </w:r>
+          </w:p>
+        </w:tc>
+        <w:tc>
+          <w:tcPr>
+            <w:tcW w:type="dxa" w:w="2016"/>
+            <w:shd w:val="clear" w:color="auto" w:fill="1F3864"/>
+          </w:tcPr>
+          <w:p>
+            <w:pPr>
+              <w:spacing w:before="40" w:after="40"/>
+              <w:jc w:val="right"/>
+            </w:pPr>
+            <w:r/>
+            <w:r>
+              <w:rPr>
+                <w:rFonts w:ascii="Calibri" w:hAnsi="Calibri"/>
+                <w:b/>
+                <w:color w:val="FFFFFF"/>
+                <w:sz w:val="18"/>
+              </w:rPr>
+              <w:t>Outer</w:t>
+            </w:r>
+          </w:p>
+        </w:tc>
+        <w:tc>
+          <w:tcPr>
+            <w:tcW w:type="dxa" w:w="2016"/>
+            <w:shd w:val="clear" w:color="auto" w:fill="1F3864"/>
+          </w:tcPr>
+          <w:p>
+            <w:pPr>
+              <w:spacing w:before="40" w:after="40"/>
+              <w:jc w:val="right"/>
+            </w:pPr>
+            <w:r/>
+            <w:r>
+              <w:rPr>
+                <w:rFonts w:ascii="Calibri" w:hAnsi="Calibri"/>
+                <w:b/>
+                <w:color w:val="FFFFFF"/>
+                <w:sz w:val="18"/>
+              </w:rPr>
+              <w:t>Inner</w:t>
+            </w:r>
+          </w:p>
+        </w:tc>
+        <w:tc>
+          <w:tcPr>
+            <w:tcW w:type="dxa" w:w="2304"/>
+            <w:shd w:val="clear" w:color="auto" w:fill="1F3864"/>
+          </w:tcPr>
+          <w:p>
+            <w:pPr>
+              <w:spacing w:before="40" w:after="40"/>
+              <w:jc w:val="right"/>
+            </w:pPr>
+            <w:r/>
+            <w:r>
+              <w:rPr>
+                <w:rFonts w:ascii="Calibri" w:hAnsi="Calibri"/>
+                <w:b/>
+                <w:color w:val="FFFFFF"/>
+                <w:sz w:val="18"/>
+              </w:rPr>
+              <w:t>Inner lifts at LLTD</w:t>
+            </w:r>
+          </w:p>
+        </w:tc>
+      </w:tr>
+      <w:tr>
+        <w:tc>
+          <w:tcPr>
+            <w:tcW w:type="dxa" w:w="1440"/>
+          </w:tcPr>
+          <w:p>
+            <w:pPr>
+              <w:spacing w:before="40" w:after="40"/>
+              <w:jc w:val="left"/>
+            </w:pPr>
+            <w:r/>
+            <w:r>
+              <w:rPr>
+                <w:rFonts w:ascii="Calibri" w:hAnsi="Calibri"/>
+                <w:b w:val="0"/>
+                <w:color w:val="1A1A1A"/>
+                <w:sz w:val="19"/>
+              </w:rPr>
+              <w:t>Front</w:t>
+            </w:r>
+          </w:p>
+        </w:tc>
+        <w:tc>
+          <w:tcPr>
+            <w:tcW w:type="dxa" w:w="2160"/>
+          </w:tcPr>
+          <w:p>
+            <w:pPr>
+              <w:spacing w:before="40" w:after="40"/>
+              <w:jc w:val="right"/>
+            </w:pPr>
+            <w:r/>
+            <w:r>
+              <w:rPr>
+                <w:rFonts w:ascii="Consolas" w:hAnsi="Consolas"/>
+                <w:b w:val="0"/>
+                <w:color w:val="1A1A1A"/>
+                <w:sz w:val="19"/>
+              </w:rPr>
+              <w:t>695.3 N</w:t>
+            </w:r>
+          </w:p>
+        </w:tc>
+        <w:tc>
+          <w:tcPr>
+            <w:tcW w:type="dxa" w:w="2016"/>
+          </w:tcPr>
+          <w:p>
+            <w:pPr>
+              <w:spacing w:before="40" w:after="40"/>
+              <w:jc w:val="right"/>
+            </w:pPr>
+            <w:r/>
+            <w:r>
+              <w:rPr>
+                <w:rFonts w:ascii="Consolas" w:hAnsi="Consolas"/>
+                <w:b w:val="0"/>
+                <w:color w:val="1A1A1A"/>
+                <w:sz w:val="19"/>
+              </w:rPr>
+              <w:t>1233.6 N</w:t>
+            </w:r>
+          </w:p>
+        </w:tc>
+        <w:tc>
+          <w:tcPr>
+            <w:tcW w:type="dxa" w:w="2016"/>
+          </w:tcPr>
+          <w:p>
+            <w:pPr>
+              <w:spacing w:before="40" w:after="40"/>
+              <w:jc w:val="right"/>
+            </w:pPr>
+            <w:r/>
+            <w:r>
+              <w:rPr>
+                <w:rFonts w:ascii="Consolas" w:hAnsi="Consolas"/>
+                <w:b w:val="0"/>
+                <w:color w:val="1A1A1A"/>
+                <w:sz w:val="19"/>
+              </w:rPr>
+              <w:t>157.0 N</w:t>
+            </w:r>
+          </w:p>
+        </w:tc>
+        <w:tc>
+          <w:tcPr>
+            <w:tcW w:type="dxa" w:w="2304"/>
+          </w:tcPr>
+          <w:p>
+            <w:pPr>
+              <w:spacing w:before="40" w:after="40"/>
+              <w:jc w:val="right"/>
+            </w:pPr>
+            <w:r/>
+            <w:r>
+              <w:rPr>
+                <w:rFonts w:ascii="Consolas" w:hAnsi="Consolas"/>
+                <w:b w:val="0"/>
+                <w:color w:val="1A1A1A"/>
+                <w:sz w:val="19"/>
+              </w:rPr>
+              <w:t>0.581</w:t>
+            </w:r>
+          </w:p>
+        </w:tc>
+      </w:tr>
+      <w:tr>
+        <w:tc>
+          <w:tcPr>
+            <w:tcW w:type="dxa" w:w="1440"/>
+            <w:shd w:val="clear" w:color="auto" w:fill="F2F3F5"/>
+          </w:tcPr>
+          <w:p>
+            <w:pPr>
+              <w:spacing w:before="40" w:after="40"/>
+              <w:jc w:val="left"/>
+            </w:pPr>
+            <w:r/>
+            <w:r>
+              <w:rPr>
+                <w:rFonts w:ascii="Calibri" w:hAnsi="Calibri"/>
+                <w:b w:val="0"/>
+                <w:color w:val="1A1A1A"/>
+                <w:sz w:val="19"/>
+              </w:rPr>
+              <w:t>Rear</w:t>
+            </w:r>
+          </w:p>
+        </w:tc>
+        <w:tc>
+          <w:tcPr>
+            <w:tcW w:type="dxa" w:w="2160"/>
+            <w:shd w:val="clear" w:color="auto" w:fill="F2F3F5"/>
+          </w:tcPr>
+          <w:p>
+            <w:pPr>
+              <w:spacing w:before="40" w:after="40"/>
+              <w:jc w:val="right"/>
+            </w:pPr>
+            <w:r/>
+            <w:r>
+              <w:rPr>
+                <w:rFonts w:ascii="Consolas" w:hAnsi="Consolas"/>
+                <w:b w:val="0"/>
+                <w:color w:val="1A1A1A"/>
+                <w:sz w:val="19"/>
+              </w:rPr>
+              <w:t>849.8 N</w:t>
+            </w:r>
+          </w:p>
+        </w:tc>
+        <w:tc>
+          <w:tcPr>
+            <w:tcW w:type="dxa" w:w="2016"/>
+            <w:shd w:val="clear" w:color="auto" w:fill="F2F3F5"/>
+          </w:tcPr>
+          <w:p>
+            <w:pPr>
+              <w:spacing w:before="40" w:after="40"/>
+              <w:jc w:val="right"/>
+            </w:pPr>
+            <w:r/>
+            <w:r>
+              <w:rPr>
+                <w:rFonts w:ascii="Consolas" w:hAnsi="Consolas"/>
+                <w:b w:val="0"/>
+                <w:color w:val="1A1A1A"/>
+                <w:sz w:val="19"/>
+              </w:rPr>
+              <w:t>1529.6 N</w:t>
+            </w:r>
+          </w:p>
+        </w:tc>
+        <w:tc>
+          <w:tcPr>
+            <w:tcW w:type="dxa" w:w="2016"/>
+            <w:shd w:val="clear" w:color="auto" w:fill="F2F3F5"/>
+          </w:tcPr>
+          <w:p>
+            <w:pPr>
+              <w:spacing w:before="40" w:after="40"/>
+              <w:jc w:val="right"/>
+            </w:pPr>
+            <w:r/>
+            <w:r>
+              <w:rPr>
+                <w:rFonts w:ascii="Consolas" w:hAnsi="Consolas"/>
+                <w:b w:val="0"/>
+                <w:color w:val="1A1A1A"/>
+                <w:sz w:val="19"/>
+              </w:rPr>
+              <w:t>170.0 N</w:t>
+            </w:r>
+          </w:p>
+        </w:tc>
+        <w:tc>
+          <w:tcPr>
+            <w:tcW w:type="dxa" w:w="2304"/>
+            <w:shd w:val="clear" w:color="auto" w:fill="F2F3F5"/>
+          </w:tcPr>
+          <w:p>
+            <w:pPr>
+              <w:spacing w:before="40" w:after="40"/>
+              <w:jc w:val="right"/>
+            </w:pPr>
+            <w:r/>
+            <w:r>
+              <w:rPr>
+                <w:rFonts w:ascii="Consolas" w:hAnsi="Consolas"/>
+                <w:b w:val="0"/>
+                <w:color w:val="1A1A1A"/>
+                <w:sz w:val="19"/>
+              </w:rPr>
+              <w:t>0.312</w:t>
+            </w:r>
+          </w:p>
+        </w:tc>
+      </w:tr>
+    </w:tbl>
+    <w:p>
+      <w:pPr>
+        <w:spacing w:after="0"/>
+      </w:pPr>
+    </w:p>
+    <w:p>
+      <w:pPr>
+        <w:spacing w:before="60" w:after="120"/>
+      </w:pPr>
+      <w:r>
+        <w:rPr>
+          <w:rFonts w:ascii="Calibri" w:hAnsi="Calibri"/>
+          <w:i w:val="0"/>
+          <w:color w:val="595959"/>
+          <w:sz w:val="18"/>
+        </w:rPr>
+        <w:t>The usable band is LLTD 0.312 to 0.581. Outside it one inner wheel lifts at 1.50 g and every force in this section is void — the model loads a single outer wheel.</w:t>
+      </w:r>
     </w:p>
     <w:p>
       <w:pPr>

</xml_diff>